<commit_message>
Word para dirección: suma dónde entran los cajeros y el newsletter
Co-Authored-By: Claude Opus 5.5 <noreply@anthropic.com>
Claude-Session: https://claude.ai/code/session_01Q9G2icwp4KTRBVtWqefkK2
</commit_message>
<xml_diff>
--- a/documentos/Club Burger Couple - explicacion para direccion.docx
+++ b/documentos/Club Burger Couple - explicacion para direccion.docx
@@ -574,7 +574,7 @@
               <w:spacing w:after="0" w:line="270"/>
             </w:pPr>
             <w:r>
-              <w:t xml:space="preserve">Costo mensual</w:t>
+              <w:t xml:space="preserve">Newsletter</w:t>
             </w:r>
           </w:p>
         </w:tc>
@@ -600,7 +600,7 @@
               <w:spacing w:after="0" w:line="270"/>
             </w:pPr>
             <w:r>
-              <w:t xml:space="preserve">Aprox. US$10 por mes (Supabase). La web sigue siendo gratis (Cloudflare). Posible costo de un servicio de mails si se superan los límites gratuitos.</w:t>
+              <w:t xml:space="preserve">Al registrarse, el cliente puede aceptar (aparte y opcional) recibir novedades por mail. Los administradores descargan en Excel solo los mails de quienes aceptaron.</w:t>
             </w:r>
           </w:p>
         </w:tc>
@@ -630,6 +630,62 @@
               <w:spacing w:after="0" w:line="270"/>
             </w:pPr>
             <w:r>
+              <w:t xml:space="preserve">Costo mensual</w:t>
+            </w:r>
+          </w:p>
+        </w:tc>
+        <w:tc>
+          <w:tcPr>
+            <w:tcW w:type="dxa" w:w="6426"/>
+            <w:tcBorders>
+              <w:top w:val="single" w:color="D9CFC0" w:sz="4"/>
+              <w:left w:val="single" w:color="D9CFC0" w:sz="4"/>
+              <w:bottom w:val="single" w:color="D9CFC0" w:sz="4"/>
+              <w:right w:val="single" w:color="D9CFC0" w:sz="4"/>
+            </w:tcBorders>
+            <w:tcMar>
+              <w:top w:type="dxa" w:w="80"/>
+              <w:left w:type="dxa" w:w="120"/>
+              <w:bottom w:type="dxa" w:w="80"/>
+              <w:right w:type="dxa" w:w="120"/>
+            </w:tcMar>
+          </w:tcPr>
+          <w:p>
+            <w:pPr>
+              <w:spacing w:after="0" w:line="270"/>
+            </w:pPr>
+            <w:r>
+              <w:t xml:space="preserve">Aprox. US$10 por mes (Supabase). La web sigue siendo gratis (Cloudflare). Posible costo de un servicio de mails si se superan los límites gratuitos.</w:t>
+            </w:r>
+          </w:p>
+        </w:tc>
+      </w:tr>
+      <w:tr>
+        <w:trPr>
+          <w:tblHeader w:val="false"/>
+        </w:trPr>
+        <w:tc>
+          <w:tcPr>
+            <w:tcW w:type="dxa" w:w="2600"/>
+            <w:tcBorders>
+              <w:top w:val="single" w:color="D9CFC0" w:sz="4"/>
+              <w:left w:val="single" w:color="D9CFC0" w:sz="4"/>
+              <w:bottom w:val="single" w:color="D9CFC0" w:sz="4"/>
+              <w:right w:val="single" w:color="D9CFC0" w:sz="4"/>
+            </w:tcBorders>
+            <w:shd w:fill="FBF7F0" w:color="auto" w:val="clear"/>
+            <w:tcMar>
+              <w:top w:type="dxa" w:w="80"/>
+              <w:left w:type="dxa" w:w="120"/>
+              <w:bottom w:type="dxa" w:w="80"/>
+              <w:right w:type="dxa" w:w="120"/>
+            </w:tcMar>
+          </w:tcPr>
+          <w:p>
+            <w:pPr>
+              <w:spacing w:after="0" w:line="270"/>
+            </w:pPr>
+            <w:r>
               <w:t xml:space="preserve">Lo que falta</w:t>
             </w:r>
           </w:p>
@@ -643,6 +699,7 @@
               <w:bottom w:val="single" w:color="D9CFC0" w:sz="4"/>
               <w:right w:val="single" w:color="D9CFC0" w:sz="4"/>
             </w:tcBorders>
+            <w:shd w:fill="FBF7F0" w:color="auto" w:val="clear"/>
             <w:tcMar>
               <w:top w:type="dxa" w:w="80"/>
               <w:left w:type="dxa" w:w="120"/>
@@ -2805,6 +2862,613 @@
     </w:p>
     <w:p>
       <w:pPr>
+        <w:pStyle w:val="Heading2"/>
+      </w:pPr>
+      <w:r>
+        <w:t xml:space="preserve">4.5 Dónde entran los cajeros</w:t>
+      </w:r>
+    </w:p>
+    <w:p>
+      <w:pPr>
+        <w:spacing w:after="120" w:line="300"/>
+      </w:pPr>
+      <w:r>
+        <w:t xml:space="preserve">El panel de caja es una </w:t>
+      </w:r>
+      <w:r>
+        <w:rPr>
+          <w:b/>
+          <w:bCs/>
+        </w:rPr>
+        <w:t xml:space="preserve">página aparte dentro de la misma web</w:t>
+      </w:r>
+      <w:r>
+        <w:t xml:space="preserve">, solo para el personal. No aparece en ningún menú de la web pública.</w:t>
+      </w:r>
+    </w:p>
+    <w:tbl>
+      <w:tblPr>
+        <w:tblW w:type="dxa" w:w="9026"/>
+        <w:tblBorders>
+          <w:top w:val="single" w:color="auto" w:sz="4"/>
+          <w:left w:val="single" w:color="auto" w:sz="4"/>
+          <w:bottom w:val="single" w:color="auto" w:sz="4"/>
+          <w:right w:val="single" w:color="auto" w:sz="4"/>
+          <w:insideH w:val="single" w:color="auto" w:sz="4"/>
+          <w:insideV w:val="single" w:color="auto" w:sz="4"/>
+        </w:tblBorders>
+      </w:tblPr>
+      <w:tblGrid>
+        <w:gridCol w:w="9026"/>
+      </w:tblGrid>
+      <w:tr>
+        <w:tc>
+          <w:tcPr>
+            <w:tcW w:type="dxa" w:w="9026"/>
+            <w:tcBorders>
+              <w:top w:val="single" w:color="3DAAA7" w:sz="4"/>
+              <w:left w:val="single" w:color="3DAAA7" w:sz="24"/>
+              <w:bottom w:val="single" w:color="3DAAA7" w:sz="4"/>
+              <w:right w:val="single" w:color="3DAAA7" w:sz="4"/>
+            </w:tcBorders>
+            <w:shd w:fill="FFFBF3" w:color="auto" w:val="clear"/>
+            <w:tcMar>
+              <w:top w:type="dxa" w:w="140"/>
+              <w:left w:type="dxa" w:w="200"/>
+              <w:bottom w:type="dxa" w:w="140"/>
+              <w:right w:type="dxa" w:w="200"/>
+            </w:tcMar>
+          </w:tcPr>
+          <w:p>
+            <w:pPr>
+              <w:spacing w:after="80"/>
+            </w:pPr>
+            <w:r>
+              <w:rPr>
+                <w:b/>
+                <w:bCs/>
+              </w:rPr>
+              <w:t xml:space="preserve">Dirección del panel de caja</w:t>
+            </w:r>
+          </w:p>
+          <w:p>
+            <w:pPr>
+              <w:spacing w:after="60" w:line="280"/>
+            </w:pPr>
+            <w:r>
+              <w:rPr>
+                <w:b/>
+                <w:bCs/>
+              </w:rPr>
+              <w:t xml:space="preserve">burgercouple-web.pages.dev/club/caja.html</w:t>
+            </w:r>
+          </w:p>
+          <w:p>
+            <w:pPr>
+              <w:spacing w:after="60" w:line="280"/>
+            </w:pPr>
+            <w:r>
+              <w:t xml:space="preserve">Si más adelante se compra un dominio propio, pasaría a ser algo como burgercouple.com.ar/club/caja.html.</w:t>
+            </w:r>
+          </w:p>
+        </w:tc>
+      </w:tr>
+    </w:tbl>
+    <w:p>
+      <w:pPr>
+        <w:spacing w:after="120"/>
+      </w:pPr>
+    </w:p>
+    <w:p>
+      <w:pPr>
+        <w:pStyle w:val="ListParagraph"/>
+        <w:numPr>
+          <w:ilvl w:val="0"/>
+          <w:numId w:val="2"/>
+        </w:numPr>
+        <w:spacing w:after="80" w:line="290"/>
+      </w:pPr>
+      <w:r>
+        <w:rPr>
+          <w:b/>
+          <w:bCs/>
+        </w:rPr>
+        <w:t xml:space="preserve">No se instala ninguna aplicación.</w:t>
+      </w:r>
+      <w:r>
+        <w:t xml:space="preserve"> Se abre en el navegador del celular o la tablet (Chrome o Safari), como cualquier página.</w:t>
+      </w:r>
+    </w:p>
+    <w:p>
+      <w:pPr>
+        <w:pStyle w:val="ListParagraph"/>
+        <w:numPr>
+          <w:ilvl w:val="0"/>
+          <w:numId w:val="2"/>
+        </w:numPr>
+        <w:spacing w:after="80" w:line="290"/>
+      </w:pPr>
+      <w:r>
+        <w:rPr>
+          <w:b/>
+          <w:bCs/>
+        </w:rPr>
+        <w:t xml:space="preserve">Los clientes no la ven,</w:t>
+      </w:r>
+      <w:r>
+        <w:t xml:space="preserve"> y si alguien escribe la dirección de casualidad no puede hacer nada: sin un usuario habilitado como personal, el sistema rechaza todo.</w:t>
+      </w:r>
+    </w:p>
+    <w:p>
+      <w:pPr>
+        <w:spacing w:after="120" w:line="300"/>
+      </w:pPr>
+      <w:r>
+        <w:rPr>
+          <w:b/>
+          <w:bCs/>
+        </w:rPr>
+        <w:t xml:space="preserve">Preparación de cada dispositivo (una sola vez, la hace el encargado):</w:t>
+      </w:r>
+    </w:p>
+    <w:p>
+      <w:pPr>
+        <w:pStyle w:val="ListParagraph"/>
+        <w:numPr>
+          <w:ilvl w:val="0"/>
+          <w:numId w:val="6"/>
+        </w:numPr>
+        <w:spacing w:after="100" w:line="290"/>
+      </w:pPr>
+      <w:r>
+        <w:t xml:space="preserve">Abrir la dirección del panel en el navegador.</w:t>
+      </w:r>
+    </w:p>
+    <w:p>
+      <w:pPr>
+        <w:pStyle w:val="ListParagraph"/>
+        <w:numPr>
+          <w:ilvl w:val="0"/>
+          <w:numId w:val="6"/>
+        </w:numPr>
+        <w:spacing w:after="100" w:line="290"/>
+      </w:pPr>
+      <w:r>
+        <w:t xml:space="preserve">Tocar “Agregar a pantalla de inicio”: queda un ícono en el celular, como si fuera una aplicación.</w:t>
+      </w:r>
+    </w:p>
+    <w:p>
+      <w:pPr>
+        <w:pStyle w:val="ListParagraph"/>
+        <w:numPr>
+          <w:ilvl w:val="0"/>
+          <w:numId w:val="6"/>
+        </w:numPr>
+        <w:spacing w:after="100" w:line="290"/>
+      </w:pPr>
+      <w:r>
+        <w:t xml:space="preserve">Entrar con el usuario del cajero (su mail y su contraseña).</w:t>
+      </w:r>
+    </w:p>
+    <w:p>
+      <w:pPr>
+        <w:pStyle w:val="ListParagraph"/>
+        <w:numPr>
+          <w:ilvl w:val="0"/>
+          <w:numId w:val="6"/>
+        </w:numPr>
+        <w:spacing w:after="100" w:line="290"/>
+      </w:pPr>
+      <w:r>
+        <w:t xml:space="preserve">La primera vez que toca “Escanear QR”, el celular pide permiso para usar la cámara: tocar “Permitir”.</w:t>
+      </w:r>
+    </w:p>
+    <w:p>
+      <w:pPr>
+        <w:pStyle w:val="ListParagraph"/>
+        <w:numPr>
+          <w:ilvl w:val="0"/>
+          <w:numId w:val="6"/>
+        </w:numPr>
+        <w:spacing w:after="100" w:line="290"/>
+      </w:pPr>
+      <w:r>
+        <w:t xml:space="preserve">Elegir el local en el selector de arriba (queda recordado en ese dispositivo).</w:t>
+      </w:r>
+    </w:p>
+    <w:p>
+      <w:pPr>
+        <w:spacing w:after="120" w:line="300"/>
+      </w:pPr>
+      <w:r>
+        <w:rPr>
+          <w:b/>
+          <w:bCs/>
+        </w:rPr>
+        <w:t xml:space="preserve">Todos los días: </w:t>
+      </w:r>
+      <w:r>
+        <w:t xml:space="preserve">el cajero toca el ícono y ya está adentro. La sesión queda abierta; no tiene que escribir la contraseña cada vez.</w:t>
+      </w:r>
+    </w:p>
+    <w:p>
+      <w:pPr>
+        <w:spacing w:after="120" w:line="300"/>
+      </w:pPr>
+      <w:r>
+        <w:rPr>
+          <w:b/>
+          <w:bCs/>
+        </w:rPr>
+        <w:t xml:space="preserve">Decisión a tomar: ¿qué celular se usa?</w:t>
+      </w:r>
+    </w:p>
+    <w:tbl>
+      <w:tblPr>
+        <w:tblW w:type="dxa" w:w="9026"/>
+        <w:tblBorders>
+          <w:top w:val="single" w:color="auto" w:sz="4"/>
+          <w:left w:val="single" w:color="auto" w:sz="4"/>
+          <w:bottom w:val="single" w:color="auto" w:sz="4"/>
+          <w:right w:val="single" w:color="auto" w:sz="4"/>
+          <w:insideH w:val="single" w:color="auto" w:sz="4"/>
+          <w:insideV w:val="single" w:color="auto" w:sz="4"/>
+        </w:tblBorders>
+      </w:tblPr>
+      <w:tblGrid>
+        <w:gridCol w:w="2600"/>
+        <w:gridCol w:w="3213"/>
+        <w:gridCol w:w="3213"/>
+      </w:tblGrid>
+      <w:tr>
+        <w:trPr>
+          <w:tblHeader/>
+        </w:trPr>
+        <w:tc>
+          <w:tcPr>
+            <w:tcW w:type="dxa" w:w="2600"/>
+            <w:tcBorders>
+              <w:top w:val="single" w:color="D9CFC0" w:sz="4"/>
+              <w:left w:val="single" w:color="D9CFC0" w:sz="4"/>
+              <w:bottom w:val="single" w:color="D9CFC0" w:sz="4"/>
+              <w:right w:val="single" w:color="D9CFC0" w:sz="4"/>
+            </w:tcBorders>
+            <w:shd w:fill="612F6D" w:color="auto" w:val="clear"/>
+            <w:tcMar>
+              <w:top w:type="dxa" w:w="80"/>
+              <w:left w:type="dxa" w:w="120"/>
+              <w:bottom w:type="dxa" w:w="80"/>
+              <w:right w:type="dxa" w:w="120"/>
+            </w:tcMar>
+          </w:tcPr>
+          <w:p>
+            <w:pPr>
+              <w:spacing w:after="0" w:line="270"/>
+            </w:pPr>
+            <w:r>
+              <w:rPr>
+                <w:b/>
+                <w:bCs/>
+                <w:color w:val="FFFFFF"/>
+              </w:rPr>
+              <w:t xml:space="preserve">Opción</w:t>
+            </w:r>
+          </w:p>
+        </w:tc>
+        <w:tc>
+          <w:tcPr>
+            <w:tcW w:type="dxa" w:w="3213"/>
+            <w:tcBorders>
+              <w:top w:val="single" w:color="D9CFC0" w:sz="4"/>
+              <w:left w:val="single" w:color="D9CFC0" w:sz="4"/>
+              <w:bottom w:val="single" w:color="D9CFC0" w:sz="4"/>
+              <w:right w:val="single" w:color="D9CFC0" w:sz="4"/>
+            </w:tcBorders>
+            <w:shd w:fill="612F6D" w:color="auto" w:val="clear"/>
+            <w:tcMar>
+              <w:top w:type="dxa" w:w="80"/>
+              <w:left w:type="dxa" w:w="120"/>
+              <w:bottom w:type="dxa" w:w="80"/>
+              <w:right w:type="dxa" w:w="120"/>
+            </w:tcMar>
+          </w:tcPr>
+          <w:p>
+            <w:pPr>
+              <w:spacing w:after="0" w:line="270"/>
+            </w:pPr>
+            <w:r>
+              <w:rPr>
+                <w:b/>
+                <w:bCs/>
+                <w:color w:val="FFFFFF"/>
+              </w:rPr>
+              <w:t xml:space="preserve">A favor</w:t>
+            </w:r>
+          </w:p>
+        </w:tc>
+        <w:tc>
+          <w:tcPr>
+            <w:tcW w:type="dxa" w:w="3213"/>
+            <w:tcBorders>
+              <w:top w:val="single" w:color="D9CFC0" w:sz="4"/>
+              <w:left w:val="single" w:color="D9CFC0" w:sz="4"/>
+              <w:bottom w:val="single" w:color="D9CFC0" w:sz="4"/>
+              <w:right w:val="single" w:color="D9CFC0" w:sz="4"/>
+            </w:tcBorders>
+            <w:shd w:fill="612F6D" w:color="auto" w:val="clear"/>
+            <w:tcMar>
+              <w:top w:type="dxa" w:w="80"/>
+              <w:left w:type="dxa" w:w="120"/>
+              <w:bottom w:type="dxa" w:w="80"/>
+              <w:right w:type="dxa" w:w="120"/>
+            </w:tcMar>
+          </w:tcPr>
+          <w:p>
+            <w:pPr>
+              <w:spacing w:after="0" w:line="270"/>
+            </w:pPr>
+            <w:r>
+              <w:rPr>
+                <w:b/>
+                <w:bCs/>
+                <w:color w:val="FFFFFF"/>
+              </w:rPr>
+              <w:t xml:space="preserve">En contra</w:t>
+            </w:r>
+          </w:p>
+        </w:tc>
+      </w:tr>
+      <w:tr>
+        <w:trPr>
+          <w:tblHeader w:val="false"/>
+        </w:trPr>
+        <w:tc>
+          <w:tcPr>
+            <w:tcW w:type="dxa" w:w="2600"/>
+            <w:tcBorders>
+              <w:top w:val="single" w:color="D9CFC0" w:sz="4"/>
+              <w:left w:val="single" w:color="D9CFC0" w:sz="4"/>
+              <w:bottom w:val="single" w:color="D9CFC0" w:sz="4"/>
+              <w:right w:val="single" w:color="D9CFC0" w:sz="4"/>
+            </w:tcBorders>
+            <w:tcMar>
+              <w:top w:type="dxa" w:w="80"/>
+              <w:left w:type="dxa" w:w="120"/>
+              <w:bottom w:type="dxa" w:w="80"/>
+              <w:right w:type="dxa" w:w="120"/>
+            </w:tcMar>
+          </w:tcPr>
+          <w:p>
+            <w:pPr>
+              <w:spacing w:after="0" w:line="270"/>
+            </w:pPr>
+            <w:r>
+              <w:t xml:space="preserve">Un celular o tablet del local (recomendado)</w:t>
+            </w:r>
+          </w:p>
+        </w:tc>
+        <w:tc>
+          <w:tcPr>
+            <w:tcW w:type="dxa" w:w="3213"/>
+            <w:tcBorders>
+              <w:top w:val="single" w:color="D9CFC0" w:sz="4"/>
+              <w:left w:val="single" w:color="D9CFC0" w:sz="4"/>
+              <w:bottom w:val="single" w:color="D9CFC0" w:sz="4"/>
+              <w:right w:val="single" w:color="D9CFC0" w:sz="4"/>
+            </w:tcBorders>
+            <w:tcMar>
+              <w:top w:type="dxa" w:w="80"/>
+              <w:left w:type="dxa" w:w="120"/>
+              <w:bottom w:type="dxa" w:w="80"/>
+              <w:right w:type="dxa" w:w="120"/>
+            </w:tcMar>
+          </w:tcPr>
+          <w:p>
+            <w:pPr>
+              <w:spacing w:after="0" w:line="270"/>
+            </w:pPr>
+            <w:r>
+              <w:t xml:space="preserve">Siempre está en la caja, cargado y con el local elegido. Los cajeros no usan su teléfono personal.</w:t>
+            </w:r>
+          </w:p>
+        </w:tc>
+        <w:tc>
+          <w:tcPr>
+            <w:tcW w:type="dxa" w:w="3213"/>
+            <w:tcBorders>
+              <w:top w:val="single" w:color="D9CFC0" w:sz="4"/>
+              <w:left w:val="single" w:color="D9CFC0" w:sz="4"/>
+              <w:bottom w:val="single" w:color="D9CFC0" w:sz="4"/>
+              <w:right w:val="single" w:color="D9CFC0" w:sz="4"/>
+            </w:tcBorders>
+            <w:tcMar>
+              <w:top w:type="dxa" w:w="80"/>
+              <w:left w:type="dxa" w:w="120"/>
+              <w:bottom w:type="dxa" w:w="80"/>
+              <w:right w:type="dxa" w:w="120"/>
+            </w:tcMar>
+          </w:tcPr>
+          <w:p>
+            <w:pPr>
+              <w:spacing w:after="0" w:line="270"/>
+            </w:pPr>
+            <w:r>
+              <w:t xml:space="preserve">Si hay varios cajeros por turno, cada uno entra con su usuario al empezar y toca “Salir” al irse; si no, lo que carga uno queda a nombre de otro.</w:t>
+            </w:r>
+          </w:p>
+        </w:tc>
+      </w:tr>
+      <w:tr>
+        <w:trPr>
+          <w:tblHeader w:val="false"/>
+        </w:trPr>
+        <w:tc>
+          <w:tcPr>
+            <w:tcW w:type="dxa" w:w="2600"/>
+            <w:tcBorders>
+              <w:top w:val="single" w:color="D9CFC0" w:sz="4"/>
+              <w:left w:val="single" w:color="D9CFC0" w:sz="4"/>
+              <w:bottom w:val="single" w:color="D9CFC0" w:sz="4"/>
+              <w:right w:val="single" w:color="D9CFC0" w:sz="4"/>
+            </w:tcBorders>
+            <w:shd w:fill="FBF7F0" w:color="auto" w:val="clear"/>
+            <w:tcMar>
+              <w:top w:type="dxa" w:w="80"/>
+              <w:left w:type="dxa" w:w="120"/>
+              <w:bottom w:type="dxa" w:w="80"/>
+              <w:right w:type="dxa" w:w="120"/>
+            </w:tcMar>
+          </w:tcPr>
+          <w:p>
+            <w:pPr>
+              <w:spacing w:after="0" w:line="270"/>
+            </w:pPr>
+            <w:r>
+              <w:t xml:space="preserve">El celular personal de cada cajero</w:t>
+            </w:r>
+          </w:p>
+        </w:tc>
+        <w:tc>
+          <w:tcPr>
+            <w:tcW w:type="dxa" w:w="3213"/>
+            <w:tcBorders>
+              <w:top w:val="single" w:color="D9CFC0" w:sz="4"/>
+              <w:left w:val="single" w:color="D9CFC0" w:sz="4"/>
+              <w:bottom w:val="single" w:color="D9CFC0" w:sz="4"/>
+              <w:right w:val="single" w:color="D9CFC0" w:sz="4"/>
+            </w:tcBorders>
+            <w:shd w:fill="FBF7F0" w:color="auto" w:val="clear"/>
+            <w:tcMar>
+              <w:top w:type="dxa" w:w="80"/>
+              <w:left w:type="dxa" w:w="120"/>
+              <w:bottom w:type="dxa" w:w="80"/>
+              <w:right w:type="dxa" w:w="120"/>
+            </w:tcMar>
+          </w:tcPr>
+          <w:p>
+            <w:pPr>
+              <w:spacing w:after="0" w:line="270"/>
+            </w:pPr>
+            <w:r>
+              <w:t xml:space="preserve">Cada uno queda siempre con su propio usuario.</w:t>
+            </w:r>
+          </w:p>
+        </w:tc>
+        <w:tc>
+          <w:tcPr>
+            <w:tcW w:type="dxa" w:w="3213"/>
+            <w:tcBorders>
+              <w:top w:val="single" w:color="D9CFC0" w:sz="4"/>
+              <w:left w:val="single" w:color="D9CFC0" w:sz="4"/>
+              <w:bottom w:val="single" w:color="D9CFC0" w:sz="4"/>
+              <w:right w:val="single" w:color="D9CFC0" w:sz="4"/>
+            </w:tcBorders>
+            <w:shd w:fill="FBF7F0" w:color="auto" w:val="clear"/>
+            <w:tcMar>
+              <w:top w:type="dxa" w:w="80"/>
+              <w:left w:type="dxa" w:w="120"/>
+              <w:bottom w:type="dxa" w:w="80"/>
+              <w:right w:type="dxa" w:w="120"/>
+            </w:tcMar>
+          </w:tcPr>
+          <w:p>
+            <w:pPr>
+              <w:spacing w:after="0" w:line="270"/>
+            </w:pPr>
+            <w:r>
+              <w:t xml:space="preserve">Usa su batería y sus datos, y depende de que lo tenga encima y cargado.</w:t>
+            </w:r>
+          </w:p>
+        </w:tc>
+      </w:tr>
+      <w:tr>
+        <w:trPr>
+          <w:tblHeader w:val="false"/>
+        </w:trPr>
+        <w:tc>
+          <w:tcPr>
+            <w:tcW w:type="dxa" w:w="2600"/>
+            <w:tcBorders>
+              <w:top w:val="single" w:color="D9CFC0" w:sz="4"/>
+              <w:left w:val="single" w:color="D9CFC0" w:sz="4"/>
+              <w:bottom w:val="single" w:color="D9CFC0" w:sz="4"/>
+              <w:right w:val="single" w:color="D9CFC0" w:sz="4"/>
+            </w:tcBorders>
+            <w:tcMar>
+              <w:top w:type="dxa" w:w="80"/>
+              <w:left w:type="dxa" w:w="120"/>
+              <w:bottom w:type="dxa" w:w="80"/>
+              <w:right w:type="dxa" w:w="120"/>
+            </w:tcMar>
+          </w:tcPr>
+          <w:p>
+            <w:pPr>
+              <w:spacing w:after="0" w:line="270"/>
+            </w:pPr>
+            <w:r>
+              <w:t xml:space="preserve">Un solo usuario por local (no recomendado)</w:t>
+            </w:r>
+          </w:p>
+        </w:tc>
+        <w:tc>
+          <w:tcPr>
+            <w:tcW w:type="dxa" w:w="3213"/>
+            <w:tcBorders>
+              <w:top w:val="single" w:color="D9CFC0" w:sz="4"/>
+              <w:left w:val="single" w:color="D9CFC0" w:sz="4"/>
+              <w:bottom w:val="single" w:color="D9CFC0" w:sz="4"/>
+              <w:right w:val="single" w:color="D9CFC0" w:sz="4"/>
+            </w:tcBorders>
+            <w:tcMar>
+              <w:top w:type="dxa" w:w="80"/>
+              <w:left w:type="dxa" w:w="120"/>
+              <w:bottom w:type="dxa" w:w="80"/>
+              <w:right w:type="dxa" w:w="120"/>
+            </w:tcMar>
+          </w:tcPr>
+          <w:p>
+            <w:pPr>
+              <w:spacing w:after="0" w:line="270"/>
+            </w:pPr>
+            <w:r>
+              <w:t xml:space="preserve">Es lo más simple.</w:t>
+            </w:r>
+          </w:p>
+        </w:tc>
+        <w:tc>
+          <w:tcPr>
+            <w:tcW w:type="dxa" w:w="3213"/>
+            <w:tcBorders>
+              <w:top w:val="single" w:color="D9CFC0" w:sz="4"/>
+              <w:left w:val="single" w:color="D9CFC0" w:sz="4"/>
+              <w:bottom w:val="single" w:color="D9CFC0" w:sz="4"/>
+              <w:right w:val="single" w:color="D9CFC0" w:sz="4"/>
+            </w:tcBorders>
+            <w:tcMar>
+              <w:top w:type="dxa" w:w="80"/>
+              <w:left w:type="dxa" w:w="120"/>
+              <w:bottom w:type="dxa" w:w="80"/>
+              <w:right w:type="dxa" w:w="120"/>
+            </w:tcMar>
+          </w:tcPr>
+          <w:p>
+            <w:pPr>
+              <w:spacing w:after="0" w:line="270"/>
+            </w:pPr>
+            <w:r>
+              <w:t xml:space="preserve">Se pierde saber qué cajero cargó cada compra, que es el control contra cargas falsas.</w:t>
+            </w:r>
+          </w:p>
+        </w:tc>
+      </w:tr>
+    </w:tbl>
+    <w:p>
+      <w:r>
+        <w:br w:type="page"/>
+      </w:r>
+    </w:p>
+    <w:p>
+      <w:pPr>
         <w:pStyle w:val="Heading1"/>
       </w:pPr>
       <w:r>
@@ -3372,7 +4036,7 @@
         <w:t xml:space="preserve">Pruebas realizadas: </w:t>
       </w:r>
       <w:r>
-        <w:t xml:space="preserve">37 pruebas automáticas de seguridad y de reglas (por ejemplo: un socio no puede sumarse puntos, un cajero no puede dar de alta personal, la primera compra suma el doble, los puntos vencen a los 90 días). Pasaron todas. Se van a volver a correr en el proyecto real antes de lanzar.</w:t>
+        <w:t xml:space="preserve">45 pruebas automáticas de seguridad y de reglas (por ejemplo: un socio no puede sumarse puntos, un cajero no puede dar de alta personal, la primera compra suma el doble, los puntos vencen a los 90 días, un cajero no puede descargar los mails). Pasaron todas. Se van a volver a correr en el proyecto real antes de lanzar.</w:t>
       </w:r>
     </w:p>
     <w:p>
@@ -3385,7 +4049,15 @@
         <w:pStyle w:val="Heading1"/>
       </w:pPr>
       <w:r>
-        <w:t xml:space="preserve">6. Costos y por qué pagar los US$10 de Supabase</w:t>
+        <w:t xml:space="preserve">6. Los mails de los socios y el newsletter</w:t>
+      </w:r>
+    </w:p>
+    <w:p>
+      <w:pPr>
+        <w:spacing w:after="120" w:line="300"/>
+      </w:pPr>
+      <w:r>
+        <w:t xml:space="preserve">El club genera una base de datos propia de clientes. Para usar esos mails en un newsletter hay que hacerlo con permiso, y el sistema ya está preparado para eso.</w:t>
       </w:r>
     </w:p>
     <w:p>
@@ -3393,7 +4065,7 @@
         <w:pStyle w:val="Heading2"/>
       </w:pPr>
       <w:r>
-        <w:t xml:space="preserve">6.1 Qué es Supabase</w:t>
+        <w:t xml:space="preserve">6.1 Por qué hace falta un permiso aparte</w:t>
       </w:r>
     </w:p>
     <w:p>
@@ -3401,6 +4073,293 @@
         <w:spacing w:after="120" w:line="300"/>
       </w:pPr>
       <w:r>
+        <w:t xml:space="preserve">Cuando alguien se registra, acepta las bases del club: sumar y canjear puntos. Eso no es aceptar recibir publicidad. La ley argentina de datos personales (25.326) pide el consentimiento de la persona para usar su mail con fines publicitarios. Además, mandar mails sin permiso suele terminar en la carpeta de spam y daña la reputación de la marca.</w:t>
+      </w:r>
+    </w:p>
+    <w:p>
+      <w:pPr>
+        <w:spacing w:after="120" w:line="300"/>
+      </w:pPr>
+      <w:r>
+        <w:rPr>
+          <w:b/>
+          <w:bCs/>
+        </w:rPr>
+        <w:t xml:space="preserve">Nota: </w:t>
+      </w:r>
+      <w:r>
+        <w:t xml:space="preserve">esto conviene confirmarlo con el abogado que revise las bases y la política de privacidad.</w:t>
+      </w:r>
+    </w:p>
+    <w:p>
+      <w:pPr>
+        <w:pStyle w:val="Heading2"/>
+      </w:pPr>
+      <w:r>
+        <w:t xml:space="preserve">6.2 Cómo funciona</w:t>
+      </w:r>
+    </w:p>
+    <w:p>
+      <w:pPr>
+        <w:pStyle w:val="ListParagraph"/>
+        <w:numPr>
+          <w:ilvl w:val="0"/>
+          <w:numId w:val="2"/>
+        </w:numPr>
+        <w:spacing w:after="80" w:line="290"/>
+      </w:pPr>
+      <w:r>
+        <w:rPr>
+          <w:b/>
+          <w:bCs/>
+        </w:rPr>
+        <w:t xml:space="preserve">Al registrarse</w:t>
+      </w:r>
+      <w:r>
+        <w:t xml:space="preserve"> hay una casilla aparte, que arranca destildada y es opcional: “Quiero recibir novedades, promos y lanzamientos de Burger Couple por mail”. Quien no la marca se suma al club igual.</w:t>
+      </w:r>
+    </w:p>
+    <w:p>
+      <w:pPr>
+        <w:pStyle w:val="ListParagraph"/>
+        <w:numPr>
+          <w:ilvl w:val="0"/>
+          <w:numId w:val="2"/>
+        </w:numPr>
+        <w:spacing w:after="80" w:line="290"/>
+      </w:pPr>
+      <w:r>
+        <w:rPr>
+          <w:b/>
+          <w:bCs/>
+        </w:rPr>
+        <w:t xml:space="preserve">Queda registrado</w:t>
+      </w:r>
+      <w:r>
+        <w:t xml:space="preserve"> quién aceptó y la fecha en que lo hizo, como prueba del consentimiento.</w:t>
+      </w:r>
+    </w:p>
+    <w:p>
+      <w:pPr>
+        <w:pStyle w:val="ListParagraph"/>
+        <w:numPr>
+          <w:ilvl w:val="0"/>
+          <w:numId w:val="2"/>
+        </w:numPr>
+        <w:spacing w:after="80" w:line="290"/>
+      </w:pPr>
+      <w:r>
+        <w:rPr>
+          <w:b/>
+          <w:bCs/>
+        </w:rPr>
+        <w:t xml:space="preserve">Cada socio puede cambiarlo</w:t>
+      </w:r>
+      <w:r>
+        <w:t xml:space="preserve"> cuando quiera desde su tarjeta, con un interruptor.</w:t>
+      </w:r>
+    </w:p>
+    <w:p>
+      <w:pPr>
+        <w:pStyle w:val="ListParagraph"/>
+        <w:numPr>
+          <w:ilvl w:val="0"/>
+          <w:numId w:val="2"/>
+        </w:numPr>
+        <w:spacing w:after="80" w:line="290"/>
+      </w:pPr>
+      <w:r>
+        <w:rPr>
+          <w:b/>
+          <w:bCs/>
+        </w:rPr>
+        <w:t xml:space="preserve">La política de privacidad</w:t>
+      </w:r>
+      <w:r>
+        <w:t xml:space="preserve"> ya explica para qué se usan los mails y cómo darse de baja.</w:t>
+      </w:r>
+    </w:p>
+    <w:p>
+      <w:pPr>
+        <w:pStyle w:val="Heading2"/>
+      </w:pPr>
+      <w:r>
+        <w:t xml:space="preserve">6.3 Cómo se obtienen los mails</w:t>
+      </w:r>
+    </w:p>
+    <w:p>
+      <w:pPr>
+        <w:pStyle w:val="ListParagraph"/>
+        <w:numPr>
+          <w:ilvl w:val="0"/>
+          <w:numId w:val="7"/>
+        </w:numPr>
+        <w:spacing w:after="100" w:line="290"/>
+      </w:pPr>
+      <w:r>
+        <w:t xml:space="preserve">Un administrador entra al panel de caja (la misma página de los cajeros, con su usuario de administrador).</w:t>
+      </w:r>
+    </w:p>
+    <w:p>
+      <w:pPr>
+        <w:pStyle w:val="ListParagraph"/>
+        <w:numPr>
+          <w:ilvl w:val="0"/>
+          <w:numId w:val="7"/>
+        </w:numPr>
+        <w:spacing w:after="100" w:line="290"/>
+      </w:pPr>
+      <w:r>
+        <w:t xml:space="preserve">En la sección “Administración”, toca “Descargar mails del newsletter”.</w:t>
+      </w:r>
+    </w:p>
+    <w:p>
+      <w:pPr>
+        <w:pStyle w:val="ListParagraph"/>
+        <w:numPr>
+          <w:ilvl w:val="0"/>
+          <w:numId w:val="7"/>
+        </w:numPr>
+        <w:spacing w:after="100" w:line="290"/>
+      </w:pPr>
+      <w:r>
+        <w:t xml:space="preserve">Se descarga un archivo que se abre directo en Excel, con nombre, mail, fecha en que aceptó y nivel del socio.</w:t>
+      </w:r>
+    </w:p>
+    <w:p>
+      <w:pPr>
+        <w:pStyle w:val="ListParagraph"/>
+        <w:numPr>
+          <w:ilvl w:val="0"/>
+          <w:numId w:val="7"/>
+        </w:numPr>
+        <w:spacing w:after="100" w:line="290"/>
+      </w:pPr>
+      <w:r>
+        <w:t xml:space="preserve">Ese archivo se sube a la herramienta de newsletter que se elija (por ejemplo Mailchimp o Brevo).</w:t>
+      </w:r>
+    </w:p>
+    <w:tbl>
+      <w:tblPr>
+        <w:tblW w:type="dxa" w:w="9026"/>
+        <w:tblBorders>
+          <w:top w:val="single" w:color="auto" w:sz="4"/>
+          <w:left w:val="single" w:color="auto" w:sz="4"/>
+          <w:bottom w:val="single" w:color="auto" w:sz="4"/>
+          <w:right w:val="single" w:color="auto" w:sz="4"/>
+          <w:insideH w:val="single" w:color="auto" w:sz="4"/>
+          <w:insideV w:val="single" w:color="auto" w:sz="4"/>
+        </w:tblBorders>
+      </w:tblPr>
+      <w:tblGrid>
+        <w:gridCol w:w="9026"/>
+      </w:tblGrid>
+      <w:tr>
+        <w:tc>
+          <w:tcPr>
+            <w:tcW w:type="dxa" w:w="9026"/>
+            <w:tcBorders>
+              <w:top w:val="single" w:color="3DAAA7" w:sz="4"/>
+              <w:left w:val="single" w:color="3DAAA7" w:sz="24"/>
+              <w:bottom w:val="single" w:color="3DAAA7" w:sz="4"/>
+              <w:right w:val="single" w:color="3DAAA7" w:sz="4"/>
+            </w:tcBorders>
+            <w:shd w:fill="FFFBF3" w:color="auto" w:val="clear"/>
+            <w:tcMar>
+              <w:top w:type="dxa" w:w="140"/>
+              <w:left w:type="dxa" w:w="200"/>
+              <w:bottom w:type="dxa" w:w="140"/>
+              <w:right w:type="dxa" w:w="200"/>
+            </w:tcMar>
+          </w:tcPr>
+          <w:p>
+            <w:pPr>
+              <w:spacing w:after="80"/>
+            </w:pPr>
+            <w:r>
+              <w:rPr>
+                <w:b/>
+                <w:bCs/>
+              </w:rPr>
+              <w:t xml:space="preserve">Solo aparecen quienes aceptaron</w:t>
+            </w:r>
+          </w:p>
+          <w:p>
+            <w:pPr>
+              <w:spacing w:after="60" w:line="280"/>
+            </w:pPr>
+            <w:r>
+              <w:t xml:space="preserve">El archivo trae únicamente a los socios que marcaron la casilla de novedades. Los cajeros no pueden descargarlo: solo los administradores.</w:t>
+            </w:r>
+          </w:p>
+        </w:tc>
+      </w:tr>
+    </w:tbl>
+    <w:p>
+      <w:pPr>
+        <w:spacing w:after="120"/>
+      </w:pPr>
+    </w:p>
+    <w:p>
+      <w:pPr>
+        <w:pStyle w:val="Heading2"/>
+      </w:pPr>
+      <w:r>
+        <w:t xml:space="preserve">6.4 A tener en cuenta</w:t>
+      </w:r>
+    </w:p>
+    <w:p>
+      <w:pPr>
+        <w:pStyle w:val="ListParagraph"/>
+        <w:numPr>
+          <w:ilvl w:val="0"/>
+          <w:numId w:val="2"/>
+        </w:numPr>
+        <w:spacing w:after="80" w:line="290"/>
+      </w:pPr>
+      <w:r>
+        <w:t xml:space="preserve">Si alguien se da de baja desde el newsletter (con el link que traen esos mails), esa baja queda en la herramienta de newsletter y no se refleja en la web. Antes de cada envío conviene descargar la lista nueva, y mantener las bajas también en la herramienta. Más adelante se puede conectar para que se sincronicen solas.</w:t>
+      </w:r>
+    </w:p>
+    <w:p>
+      <w:pPr>
+        <w:pStyle w:val="ListParagraph"/>
+        <w:numPr>
+          <w:ilvl w:val="0"/>
+          <w:numId w:val="2"/>
+        </w:numPr>
+        <w:spacing w:after="80" w:line="290"/>
+      </w:pPr>
+      <w:r>
+        <w:t xml:space="preserve">Las herramientas de newsletter suelen tener un plan gratis hasta cierta cantidad de contactos o envíos; después cobran. Conviene confirmar sus precios al elegir una.</w:t>
+      </w:r>
+    </w:p>
+    <w:p>
+      <w:r>
+        <w:br w:type="page"/>
+      </w:r>
+    </w:p>
+    <w:p>
+      <w:pPr>
+        <w:pStyle w:val="Heading1"/>
+      </w:pPr>
+      <w:r>
+        <w:t xml:space="preserve">7. Costos y por qué pagar los US$10 de Supabase</w:t>
+      </w:r>
+    </w:p>
+    <w:p>
+      <w:pPr>
+        <w:pStyle w:val="Heading2"/>
+      </w:pPr>
+      <w:r>
+        <w:t xml:space="preserve">7.1 Qué es Supabase</w:t>
+      </w:r>
+    </w:p>
+    <w:p>
+      <w:pPr>
+        <w:spacing w:after="120" w:line="300"/>
+      </w:pPr>
+      <w:r>
         <w:t xml:space="preserve">Es el servicio donde se guarda la base de datos del club: las cuentas de los socios, sus contraseñas (cifradas), los puntos y el historial. También es el que manda los mails de confirmación y de recuperación de contraseña. BC OS ya usa Supabase.</w:t>
       </w:r>
     </w:p>
@@ -3409,7 +4368,7 @@
         <w:pStyle w:val="Heading2"/>
       </w:pPr>
       <w:r>
-        <w:t xml:space="preserve">6.2 Las dos opciones</w:t>
+        <w:t xml:space="preserve">7.2 Las dos opciones</w:t>
       </w:r>
     </w:p>
     <w:tbl>
@@ -4005,7 +4964,7 @@
         <w:pStyle w:val="Heading2"/>
       </w:pPr>
       <w:r>
-        <w:t xml:space="preserve">6.3 Todos los costos del club</w:t>
+        <w:t xml:space="preserve">7.3 Todos los costos del club</w:t>
       </w:r>
     </w:p>
     <w:tbl>
@@ -4392,7 +5351,7 @@
               <w:spacing w:after="0" w:line="270"/>
             </w:pPr>
             <w:r>
-              <w:t xml:space="preserve">Dispositivos en los locales</w:t>
+              <w:t xml:space="preserve">Herramienta de newsletter</w:t>
             </w:r>
           </w:p>
         </w:tc>
@@ -4418,7 +5377,7 @@
               <w:spacing w:after="0" w:line="270"/>
             </w:pPr>
             <w:r>
-              <w:t xml:space="preserve">Única vez, si no hay</w:t>
+              <w:t xml:space="preserve">US$0 para empezar</w:t>
             </w:r>
           </w:p>
         </w:tc>
@@ -4444,7 +5403,7 @@
               <w:spacing w:after="0" w:line="270"/>
             </w:pPr>
             <w:r>
-              <w:t xml:space="preserve">Un celular o tablet con cámara por local. Puede ser uno que ya tengan.</w:t>
+              <w:t xml:space="preserve">Mailchimp, Brevo u otra. Suelen ser gratis hasta cierta cantidad de contactos o envíos.</w:t>
             </w:r>
           </w:p>
         </w:tc>
@@ -4474,6 +5433,87 @@
               <w:spacing w:after="0" w:line="270"/>
             </w:pPr>
             <w:r>
+              <w:t xml:space="preserve">Dispositivos en los locales</w:t>
+            </w:r>
+          </w:p>
+        </w:tc>
+        <w:tc>
+          <w:tcPr>
+            <w:tcW w:type="dxa" w:w="2100"/>
+            <w:tcBorders>
+              <w:top w:val="single" w:color="D9CFC0" w:sz="4"/>
+              <w:left w:val="single" w:color="D9CFC0" w:sz="4"/>
+              <w:bottom w:val="single" w:color="D9CFC0" w:sz="4"/>
+              <w:right w:val="single" w:color="D9CFC0" w:sz="4"/>
+            </w:tcBorders>
+            <w:tcMar>
+              <w:top w:type="dxa" w:w="80"/>
+              <w:left w:type="dxa" w:w="120"/>
+              <w:bottom w:type="dxa" w:w="80"/>
+              <w:right w:type="dxa" w:w="120"/>
+            </w:tcMar>
+          </w:tcPr>
+          <w:p>
+            <w:pPr>
+              <w:spacing w:after="0" w:line="270"/>
+            </w:pPr>
+            <w:r>
+              <w:t xml:space="preserve">Única vez, si no hay</w:t>
+            </w:r>
+          </w:p>
+        </w:tc>
+        <w:tc>
+          <w:tcPr>
+            <w:tcW w:type="dxa" w:w="3526"/>
+            <w:tcBorders>
+              <w:top w:val="single" w:color="D9CFC0" w:sz="4"/>
+              <w:left w:val="single" w:color="D9CFC0" w:sz="4"/>
+              <w:bottom w:val="single" w:color="D9CFC0" w:sz="4"/>
+              <w:right w:val="single" w:color="D9CFC0" w:sz="4"/>
+            </w:tcBorders>
+            <w:tcMar>
+              <w:top w:type="dxa" w:w="80"/>
+              <w:left w:type="dxa" w:w="120"/>
+              <w:bottom w:type="dxa" w:w="80"/>
+              <w:right w:type="dxa" w:w="120"/>
+            </w:tcMar>
+          </w:tcPr>
+          <w:p>
+            <w:pPr>
+              <w:spacing w:after="0" w:line="270"/>
+            </w:pPr>
+            <w:r>
+              <w:t xml:space="preserve">Un celular o tablet con cámara por local. Puede ser uno que ya tengan.</w:t>
+            </w:r>
+          </w:p>
+        </w:tc>
+      </w:tr>
+      <w:tr>
+        <w:trPr>
+          <w:tblHeader w:val="false"/>
+        </w:trPr>
+        <w:tc>
+          <w:tcPr>
+            <w:tcW w:type="dxa" w:w="3400"/>
+            <w:tcBorders>
+              <w:top w:val="single" w:color="D9CFC0" w:sz="4"/>
+              <w:left w:val="single" w:color="D9CFC0" w:sz="4"/>
+              <w:bottom w:val="single" w:color="D9CFC0" w:sz="4"/>
+              <w:right w:val="single" w:color="D9CFC0" w:sz="4"/>
+            </w:tcBorders>
+            <w:shd w:fill="FBF7F0" w:color="auto" w:val="clear"/>
+            <w:tcMar>
+              <w:top w:type="dxa" w:w="80"/>
+              <w:left w:type="dxa" w:w="120"/>
+              <w:bottom w:type="dxa" w:w="80"/>
+              <w:right w:type="dxa" w:w="120"/>
+            </w:tcMar>
+          </w:tcPr>
+          <w:p>
+            <w:pPr>
+              <w:spacing w:after="0" w:line="270"/>
+            </w:pPr>
+            <w:r>
               <w:t xml:space="preserve">Revisión legal</w:t>
             </w:r>
           </w:p>
@@ -4487,6 +5527,7 @@
               <w:bottom w:val="single" w:color="D9CFC0" w:sz="4"/>
               <w:right w:val="single" w:color="D9CFC0" w:sz="4"/>
             </w:tcBorders>
+            <w:shd w:fill="FBF7F0" w:color="auto" w:val="clear"/>
             <w:tcMar>
               <w:top w:type="dxa" w:w="80"/>
               <w:left w:type="dxa" w:w="120"/>
@@ -4512,6 +5553,7 @@
               <w:bottom w:val="single" w:color="D9CFC0" w:sz="4"/>
               <w:right w:val="single" w:color="D9CFC0" w:sz="4"/>
             </w:tcBorders>
+            <w:shd w:fill="FBF7F0" w:color="auto" w:val="clear"/>
             <w:tcMar>
               <w:top w:type="dxa" w:w="80"/>
               <w:left w:type="dxa" w:w="120"/>
@@ -4560,7 +5602,7 @@
         <w:pStyle w:val="Heading1"/>
       </w:pPr>
       <w:r>
-        <w:t xml:space="preserve">7. Preguntas frecuentes</w:t>
+        <w:t xml:space="preserve">8. Preguntas frecuentes</w:t>
       </w:r>
     </w:p>
     <w:p>
@@ -4664,6 +5706,22 @@
         <w:pStyle w:val="Heading2"/>
       </w:pPr>
       <w:r>
+        <w:t xml:space="preserve">¿Podemos mandarles promos a todos los socios?</w:t>
+      </w:r>
+    </w:p>
+    <w:p>
+      <w:pPr>
+        <w:spacing w:after="120" w:line="300"/>
+      </w:pPr>
+      <w:r>
+        <w:t xml:space="preserve">Solo a los que aceptaron recibir novedades. A los demás se les pueden mandar únicamente mails sobre su cuenta del club (por ejemplo, la confirmación del registro o el cambio de contraseña).</w:t>
+      </w:r>
+    </w:p>
+    <w:p>
+      <w:pPr>
+        <w:pStyle w:val="Heading2"/>
+      </w:pPr>
+      <w:r>
         <w:t xml:space="preserve">¿Se pueden cambiar los premios o las reglas después?</w:t>
       </w:r>
     </w:p>
@@ -4680,7 +5738,7 @@
         <w:pStyle w:val="Heading1"/>
       </w:pPr>
       <w:r>
-        <w:t xml:space="preserve">8. Próximos pasos para lanzar</w:t>
+        <w:t xml:space="preserve">9. Próximos pasos para lanzar</w:t>
       </w:r>
     </w:p>
     <w:tbl>
@@ -5011,7 +6069,7 @@
               <w:spacing w:after="0" w:line="270"/>
             </w:pPr>
             <w:r>
-              <w:t xml:space="preserve">Cargar la base de datos, correr las 37 pruebas y conectar la web.</w:t>
+              <w:t xml:space="preserve">Cargar la base de datos, correr las 45 pruebas y conectar la web.</w:t>
             </w:r>
           </w:p>
         </w:tc>
@@ -5419,6 +6477,87 @@
               <w:spacing w:after="0" w:line="270"/>
             </w:pPr>
             <w:r>
+              <w:t xml:space="preserve">Elegir la herramienta de newsletter.</w:t>
+            </w:r>
+          </w:p>
+        </w:tc>
+        <w:tc>
+          <w:tcPr>
+            <w:tcW w:type="dxa" w:w="3200"/>
+            <w:tcBorders>
+              <w:top w:val="single" w:color="D9CFC0" w:sz="4"/>
+              <w:left w:val="single" w:color="D9CFC0" w:sz="4"/>
+              <w:bottom w:val="single" w:color="D9CFC0" w:sz="4"/>
+              <w:right w:val="single" w:color="D9CFC0" w:sz="4"/>
+            </w:tcBorders>
+            <w:shd w:fill="FBF7F0" w:color="auto" w:val="clear"/>
+            <w:tcMar>
+              <w:top w:type="dxa" w:w="80"/>
+              <w:left w:type="dxa" w:w="120"/>
+              <w:bottom w:type="dxa" w:w="80"/>
+              <w:right w:type="dxa" w:w="120"/>
+            </w:tcMar>
+          </w:tcPr>
+          <w:p>
+            <w:pPr>
+              <w:spacing w:after="0" w:line="270"/>
+            </w:pPr>
+            <w:r>
+              <w:t xml:space="preserve">Mati</w:t>
+            </w:r>
+          </w:p>
+        </w:tc>
+      </w:tr>
+      <w:tr>
+        <w:trPr>
+          <w:tblHeader w:val="false"/>
+        </w:trPr>
+        <w:tc>
+          <w:tcPr>
+            <w:tcW w:type="dxa" w:w="600"/>
+            <w:tcBorders>
+              <w:top w:val="single" w:color="D9CFC0" w:sz="4"/>
+              <w:left w:val="single" w:color="D9CFC0" w:sz="4"/>
+              <w:bottom w:val="single" w:color="D9CFC0" w:sz="4"/>
+              <w:right w:val="single" w:color="D9CFC0" w:sz="4"/>
+            </w:tcBorders>
+            <w:tcMar>
+              <w:top w:type="dxa" w:w="80"/>
+              <w:left w:type="dxa" w:w="120"/>
+              <w:bottom w:type="dxa" w:w="80"/>
+              <w:right w:type="dxa" w:w="120"/>
+            </w:tcMar>
+          </w:tcPr>
+          <w:p>
+            <w:pPr>
+              <w:spacing w:after="0" w:line="270"/>
+            </w:pPr>
+            <w:r>
+              <w:t xml:space="preserve">9</w:t>
+            </w:r>
+          </w:p>
+        </w:tc>
+        <w:tc>
+          <w:tcPr>
+            <w:tcW w:type="dxa" w:w="5226"/>
+            <w:tcBorders>
+              <w:top w:val="single" w:color="D9CFC0" w:sz="4"/>
+              <w:left w:val="single" w:color="D9CFC0" w:sz="4"/>
+              <w:bottom w:val="single" w:color="D9CFC0" w:sz="4"/>
+              <w:right w:val="single" w:color="D9CFC0" w:sz="4"/>
+            </w:tcBorders>
+            <w:tcMar>
+              <w:top w:type="dxa" w:w="80"/>
+              <w:left w:type="dxa" w:w="120"/>
+              <w:bottom w:type="dxa" w:w="80"/>
+              <w:right w:type="dxa" w:w="120"/>
+            </w:tcMar>
+          </w:tcPr>
+          <w:p>
+            <w:pPr>
+              <w:spacing w:after="0" w:line="270"/>
+            </w:pPr>
+            <w:r>
               <w:t xml:space="preserve">Prueba piloto en un local durante una semana antes de lanzarlo en todos.</w:t>
             </w:r>
           </w:p>
@@ -5432,7 +6571,6 @@
               <w:bottom w:val="single" w:color="D9CFC0" w:sz="4"/>
               <w:right w:val="single" w:color="D9CFC0" w:sz="4"/>
             </w:tcBorders>
-            <w:shd w:fill="FBF7F0" w:color="auto" w:val="clear"/>
             <w:tcMar>
               <w:top w:type="dxa" w:w="80"/>
               <w:left w:type="dxa" w:w="120"/>
@@ -5724,6 +6862,18 @@
     </w:lvlOverride>
   </w:num>
   <w:num w:numId="5">
+    <w:abstractNumId w:val="3"/>
+    <w:lvlOverride w:ilvl="0">
+      <w:startOverride w:val="1"/>
+    </w:lvlOverride>
+  </w:num>
+  <w:num w:numId="6">
+    <w:abstractNumId w:val="3"/>
+    <w:lvlOverride w:ilvl="0">
+      <w:startOverride w:val="1"/>
+    </w:lvlOverride>
+  </w:num>
+  <w:num w:numId="7">
     <w:abstractNumId w:val="3"/>
     <w:lvlOverride w:ilvl="0">
       <w:startOverride w:val="1"/>

</xml_diff>